<commit_message>
feat: add profile picture upload functionality and update related data models
</commit_message>
<xml_diff>
--- a/others/Crafto back-end documentation.docx
+++ b/others/Crafto back-end documentation.docx
@@ -1077,6 +1077,14 @@
       <w:r>
         <w:t xml:space="preserve"> - The craftsman's ID</w:t>
       </w:r>
+      <w:r>
+        <w:t xml:space="preserve"> on </w:t>
+      </w:r>
+      <w:proofErr w:type="spellStart"/>
+      <w:r>
+        <w:t>mongoDb</w:t>
+      </w:r>
+      <w:proofErr w:type="spellEnd"/>
     </w:p>
     <w:p>
       <w:pPr>
@@ -1287,7 +1295,13 @@
               <w:jc w:val="center"/>
             </w:pPr>
             <w:r>
-              <w:t>Multiple work sample images (JPEG/PNG, max 4MB each, 1-4 files)</w:t>
+              <w:t>Multiple work sample images (</w:t>
+            </w:r>
+            <w:r>
+              <w:t>JPG/</w:t>
+            </w:r>
+            <w:r>
+              <w:t>JPEG/PNG, max 4MB each, 1-4 files)</w:t>
             </w:r>
           </w:p>
         </w:tc>
@@ -1528,9 +1542,426 @@
         <w:t>403 Forbidden - User doesn't own this craftsman profile</w:t>
       </w:r>
     </w:p>
+    <w:p>
+      <w:pPr>
+        <w:ind w:left="360"/>
+      </w:pPr>
+    </w:p>
+    <w:p>
+      <w:pPr>
+        <w:pStyle w:val="Heading2"/>
+      </w:pPr>
+      <w:r>
+        <w:t>Upload profile picture</w:t>
+      </w:r>
+    </w:p>
+    <w:p>
+      <w:r>
+        <w:t>Upload craftsman profile picture (optional)</w:t>
+      </w:r>
+    </w:p>
+    <w:p>
+      <w:r>
+        <w:t>Type: POST</w:t>
+      </w:r>
+    </w:p>
+    <w:p>
+      <w:r>
+        <w:t xml:space="preserve">Endpoint: </w:t>
+      </w:r>
+      <w:r>
+        <w:t>{</w:t>
+      </w:r>
+      <w:proofErr w:type="spellStart"/>
+      <w:r>
+        <w:t>BaseURL</w:t>
+      </w:r>
+      <w:proofErr w:type="spellEnd"/>
+      <w:r>
+        <w:t>}/craftsman/{</w:t>
+      </w:r>
+      <w:proofErr w:type="spellStart"/>
+      <w:r>
+        <w:t>craftsmanId</w:t>
+      </w:r>
+      <w:proofErr w:type="spellEnd"/>
+      <w:r>
+        <w:t>}/</w:t>
+      </w:r>
+      <w:r>
+        <w:t>profile-picture</w:t>
+      </w:r>
+    </w:p>
+    <w:p>
+      <w:pPr>
+        <w:pStyle w:val="Heading3"/>
+      </w:pPr>
+      <w:r>
+        <w:t>Path Parameters</w:t>
+      </w:r>
+    </w:p>
+    <w:p>
+      <w:pPr>
+        <w:ind w:left="360"/>
+      </w:pPr>
+      <w:proofErr w:type="spellStart"/>
+      <w:r>
+        <w:t>craftsmanId</w:t>
+      </w:r>
+      <w:proofErr w:type="spellEnd"/>
+      <w:r>
+        <w:t xml:space="preserve"> - The craftsman's ID</w:t>
+      </w:r>
+      <w:r>
+        <w:t xml:space="preserve"> on </w:t>
+      </w:r>
+      <w:proofErr w:type="spellStart"/>
+      <w:r>
+        <w:t>mongoDb</w:t>
+      </w:r>
+      <w:proofErr w:type="spellEnd"/>
+    </w:p>
+    <w:p>
+      <w:pPr>
+        <w:pStyle w:val="Heading3"/>
+      </w:pPr>
+      <w:r>
+        <w:t>Headers</w:t>
+      </w:r>
+    </w:p>
+    <w:p>
+      <w:pPr>
+        <w:ind w:left="360"/>
+      </w:pPr>
+      <w:proofErr w:type="spellStart"/>
+      <w:r>
+        <w:t>userId</w:t>
+      </w:r>
+      <w:proofErr w:type="spellEnd"/>
+      <w:r>
+        <w:t>: user123</w:t>
+      </w:r>
+    </w:p>
+    <w:p>
+      <w:pPr>
+        <w:pStyle w:val="Heading3"/>
+      </w:pPr>
+      <w:r>
+        <w:lastRenderedPageBreak/>
+        <w:t>Body Content Type: -</w:t>
+      </w:r>
+    </w:p>
+    <w:p>
+      <w:pPr>
+        <w:ind w:firstLine="360"/>
+      </w:pPr>
+      <w:r>
+        <w:t>Form Data (multipart/form-data)</w:t>
+      </w:r>
+    </w:p>
+    <w:tbl>
+      <w:tblPr>
+        <w:tblStyle w:val="TableGrid"/>
+        <w:tblW w:w="0" w:type="auto"/>
+        <w:jc w:val="center"/>
+        <w:tblLook w:val="04A0" w:firstRow="1" w:lastRow="0" w:firstColumn="1" w:lastColumn="0" w:noHBand="0" w:noVBand="1"/>
+      </w:tblPr>
+      <w:tblGrid>
+        <w:gridCol w:w="1536"/>
+        <w:gridCol w:w="1510"/>
+        <w:gridCol w:w="1415"/>
+        <w:gridCol w:w="5220"/>
+      </w:tblGrid>
+      <w:tr>
+        <w:trPr>
+          <w:jc w:val="center"/>
+        </w:trPr>
+        <w:tc>
+          <w:tcPr>
+            <w:tcW w:w="1390" w:type="dxa"/>
+            <w:vAlign w:val="center"/>
+          </w:tcPr>
+          <w:p>
+            <w:pPr>
+              <w:jc w:val="center"/>
+              <w:rPr>
+                <w:b/>
+                <w:bCs/>
+              </w:rPr>
+            </w:pPr>
+            <w:r>
+              <w:rPr>
+                <w:b/>
+                <w:bCs/>
+              </w:rPr>
+              <w:t>Key</w:t>
+            </w:r>
+          </w:p>
+        </w:tc>
+        <w:tc>
+          <w:tcPr>
+            <w:tcW w:w="1510" w:type="dxa"/>
+            <w:vAlign w:val="center"/>
+          </w:tcPr>
+          <w:p>
+            <w:pPr>
+              <w:jc w:val="center"/>
+              <w:rPr>
+                <w:b/>
+                <w:bCs/>
+              </w:rPr>
+            </w:pPr>
+            <w:r>
+              <w:rPr>
+                <w:b/>
+                <w:bCs/>
+              </w:rPr>
+              <w:t>Type</w:t>
+            </w:r>
+          </w:p>
+        </w:tc>
+        <w:tc>
+          <w:tcPr>
+            <w:tcW w:w="1415" w:type="dxa"/>
+            <w:vAlign w:val="center"/>
+          </w:tcPr>
+          <w:p>
+            <w:pPr>
+              <w:jc w:val="center"/>
+              <w:rPr>
+                <w:b/>
+                <w:bCs/>
+              </w:rPr>
+            </w:pPr>
+            <w:r>
+              <w:rPr>
+                <w:b/>
+                <w:bCs/>
+              </w:rPr>
+              <w:t>Required</w:t>
+            </w:r>
+          </w:p>
+        </w:tc>
+        <w:tc>
+          <w:tcPr>
+            <w:tcW w:w="5220" w:type="dxa"/>
+            <w:vAlign w:val="center"/>
+          </w:tcPr>
+          <w:p>
+            <w:pPr>
+              <w:jc w:val="center"/>
+              <w:rPr>
+                <w:b/>
+                <w:bCs/>
+              </w:rPr>
+            </w:pPr>
+            <w:r>
+              <w:rPr>
+                <w:b/>
+                <w:bCs/>
+              </w:rPr>
+              <w:t>Description</w:t>
+            </w:r>
+          </w:p>
+        </w:tc>
+      </w:tr>
+      <w:tr>
+        <w:trPr>
+          <w:jc w:val="center"/>
+        </w:trPr>
+        <w:tc>
+          <w:tcPr>
+            <w:tcW w:w="1390" w:type="dxa"/>
+            <w:vAlign w:val="center"/>
+          </w:tcPr>
+          <w:p>
+            <w:pPr>
+              <w:jc w:val="center"/>
+            </w:pPr>
+            <w:proofErr w:type="spellStart"/>
+            <w:r>
+              <w:t>profilePicture</w:t>
+            </w:r>
+            <w:proofErr w:type="spellEnd"/>
+          </w:p>
+        </w:tc>
+        <w:tc>
+          <w:tcPr>
+            <w:tcW w:w="1510" w:type="dxa"/>
+            <w:vAlign w:val="center"/>
+          </w:tcPr>
+          <w:p>
+            <w:pPr>
+              <w:jc w:val="center"/>
+            </w:pPr>
+            <w:r>
+              <w:t>File</w:t>
+            </w:r>
+          </w:p>
+        </w:tc>
+        <w:tc>
+          <w:tcPr>
+            <w:tcW w:w="1415" w:type="dxa"/>
+            <w:vAlign w:val="center"/>
+          </w:tcPr>
+          <w:p>
+            <w:pPr>
+              <w:jc w:val="center"/>
+            </w:pPr>
+            <w:r>
+              <w:t>Yes</w:t>
+            </w:r>
+          </w:p>
+        </w:tc>
+        <w:tc>
+          <w:tcPr>
+            <w:tcW w:w="5220" w:type="dxa"/>
+            <w:vAlign w:val="center"/>
+          </w:tcPr>
+          <w:p>
+            <w:pPr>
+              <w:jc w:val="center"/>
+            </w:pPr>
+            <w:r>
+              <w:t>Profile picture</w:t>
+            </w:r>
+            <w:r>
+              <w:t xml:space="preserve"> (JPEG/PNG, max 4MB)</w:t>
+            </w:r>
+          </w:p>
+        </w:tc>
+      </w:tr>
+    </w:tbl>
     <w:p/>
     <w:p>
       <w:pPr>
+        <w:pStyle w:val="Heading3"/>
+      </w:pPr>
+      <w:r>
+        <w:t>Response (200 OK)</w:t>
+      </w:r>
+    </w:p>
+    <w:p>
+      <w:pPr>
+        <w:ind w:left="360"/>
+        <w:rPr>
+          <w:rFonts w:ascii="Consolas" w:hAnsi="Consolas"/>
+        </w:rPr>
+      </w:pPr>
+      <w:r>
+        <w:rPr>
+          <w:rFonts w:ascii="Consolas" w:hAnsi="Consolas"/>
+        </w:rPr>
+        <w:t>J</w:t>
+      </w:r>
+      <w:r>
+        <w:rPr>
+          <w:rFonts w:ascii="Consolas" w:hAnsi="Consolas"/>
+        </w:rPr>
+        <w:t>son</w:t>
+      </w:r>
+    </w:p>
+    <w:p>
+      <w:pPr>
+        <w:ind w:left="360"/>
+        <w:rPr>
+          <w:rFonts w:ascii="Consolas" w:hAnsi="Consolas"/>
+        </w:rPr>
+      </w:pPr>
+      <w:r>
+        <w:rPr>
+          <w:rFonts w:ascii="Consolas" w:hAnsi="Consolas"/>
+        </w:rPr>
+        <w:t>{</w:t>
+      </w:r>
+    </w:p>
+    <w:p>
+      <w:pPr>
+        <w:ind w:left="360"/>
+        <w:rPr>
+          <w:rFonts w:ascii="Consolas" w:hAnsi="Consolas"/>
+        </w:rPr>
+      </w:pPr>
+      <w:r>
+        <w:rPr>
+          <w:rFonts w:ascii="Consolas" w:hAnsi="Consolas"/>
+        </w:rPr>
+        <w:t xml:space="preserve">    "</w:t>
+      </w:r>
+      <w:proofErr w:type="spellStart"/>
+      <w:r>
+        <w:rPr>
+          <w:rFonts w:ascii="Consolas" w:hAnsi="Consolas"/>
+        </w:rPr>
+        <w:t>craftsmanId</w:t>
+      </w:r>
+      <w:proofErr w:type="spellEnd"/>
+      <w:r>
+        <w:rPr>
+          <w:rFonts w:ascii="Consolas" w:hAnsi="Consolas"/>
+        </w:rPr>
+        <w:t>": "68dd7ed7a9e82ff93b21b7d0",</w:t>
+      </w:r>
+    </w:p>
+    <w:p>
+      <w:pPr>
+        <w:ind w:left="360"/>
+        <w:rPr>
+          <w:rFonts w:ascii="Consolas" w:hAnsi="Consolas"/>
+        </w:rPr>
+      </w:pPr>
+      <w:r>
+        <w:rPr>
+          <w:rFonts w:ascii="Consolas" w:hAnsi="Consolas"/>
+        </w:rPr>
+        <w:t xml:space="preserve">    "</w:t>
+      </w:r>
+      <w:proofErr w:type="spellStart"/>
+      <w:r>
+        <w:rPr>
+          <w:rFonts w:ascii="Consolas" w:hAnsi="Consolas"/>
+        </w:rPr>
+        <w:t>profilePictureUrl</w:t>
+      </w:r>
+      <w:proofErr w:type="spellEnd"/>
+      <w:r>
+        <w:rPr>
+          <w:rFonts w:ascii="Consolas" w:hAnsi="Consolas"/>
+        </w:rPr>
+        <w:t>": "https://storage.googleapis.com/crafto-33c46.firebasestorage.app/craftsmen/68dd7ed7a9e82ff93b21b7d0/profile-pictures/profile-1761242212162.jpg",</w:t>
+      </w:r>
+    </w:p>
+    <w:p>
+      <w:pPr>
+        <w:ind w:left="360"/>
+        <w:rPr>
+          <w:rFonts w:ascii="Consolas" w:hAnsi="Consolas"/>
+        </w:rPr>
+      </w:pPr>
+      <w:r>
+        <w:rPr>
+          <w:rFonts w:ascii="Consolas" w:hAnsi="Consolas"/>
+        </w:rPr>
+        <w:t xml:space="preserve">    "message": "Profile picture uploaded successfully"</w:t>
+      </w:r>
+    </w:p>
+    <w:p>
+      <w:pPr>
+        <w:ind w:left="360"/>
+        <w:rPr>
+          <w:rFonts w:ascii="Consolas" w:hAnsi="Consolas"/>
+        </w:rPr>
+      </w:pPr>
+      <w:r>
+        <w:rPr>
+          <w:rFonts w:ascii="Consolas" w:hAnsi="Consolas"/>
+        </w:rPr>
+        <w:t>}</w:t>
+      </w:r>
+    </w:p>
+    <w:p/>
+    <w:p>
+      <w:pPr>
         <w:pStyle w:val="Heading2"/>
       </w:pPr>
       <w:r>
@@ -1616,7 +2047,526 @@
         <w:rPr>
           <w:rFonts w:ascii="Consolas" w:hAnsi="Consolas"/>
         </w:rPr>
+        <w:t>{</w:t>
+      </w:r>
+    </w:p>
+    <w:p>
+      <w:pPr>
+        <w:ind w:left="360"/>
+        <w:rPr>
+          <w:rFonts w:ascii="Consolas" w:hAnsi="Consolas"/>
+        </w:rPr>
+      </w:pPr>
+      <w:r>
+        <w:rPr>
+          <w:rFonts w:ascii="Consolas" w:hAnsi="Consolas"/>
+        </w:rPr>
+        <w:t xml:space="preserve">    "</w:t>
+      </w:r>
+      <w:proofErr w:type="spellStart"/>
+      <w:r>
+        <w:rPr>
+          <w:rFonts w:ascii="Consolas" w:hAnsi="Consolas"/>
+        </w:rPr>
+        <w:t>craftsmanId</w:t>
+      </w:r>
+      <w:proofErr w:type="spellEnd"/>
+      <w:r>
+        <w:rPr>
+          <w:rFonts w:ascii="Consolas" w:hAnsi="Consolas"/>
+        </w:rPr>
+        <w:t>": "673f5a1234567890abcdef12",</w:t>
+      </w:r>
+    </w:p>
+    <w:p>
+      <w:pPr>
+        <w:ind w:left="360"/>
+        <w:rPr>
+          <w:rFonts w:ascii="Consolas" w:hAnsi="Consolas"/>
+        </w:rPr>
+      </w:pPr>
+      <w:r>
+        <w:rPr>
+          <w:rFonts w:ascii="Consolas" w:hAnsi="Consolas"/>
+        </w:rPr>
+        <w:t xml:space="preserve">    "</w:t>
+      </w:r>
+      <w:proofErr w:type="spellStart"/>
+      <w:r>
+        <w:rPr>
+          <w:rFonts w:ascii="Consolas" w:hAnsi="Consolas"/>
+        </w:rPr>
+        <w:t>personalInfo</w:t>
+      </w:r>
+      <w:proofErr w:type="spellEnd"/>
+      <w:r>
+        <w:rPr>
+          <w:rFonts w:ascii="Consolas" w:hAnsi="Consolas"/>
+        </w:rPr>
+        <w:t>": {</w:t>
+      </w:r>
+    </w:p>
+    <w:p>
+      <w:pPr>
+        <w:ind w:left="360"/>
+        <w:rPr>
+          <w:rFonts w:ascii="Consolas" w:hAnsi="Consolas"/>
+        </w:rPr>
+      </w:pPr>
+      <w:r>
+        <w:rPr>
+          <w:rFonts w:ascii="Consolas" w:hAnsi="Consolas"/>
+        </w:rPr>
+        <w:t xml:space="preserve">        "</w:t>
+      </w:r>
+      <w:proofErr w:type="spellStart"/>
+      <w:r>
+        <w:rPr>
+          <w:rFonts w:ascii="Consolas" w:hAnsi="Consolas"/>
+        </w:rPr>
+        <w:t>firstName</w:t>
+      </w:r>
+      <w:proofErr w:type="spellEnd"/>
+      <w:r>
+        <w:rPr>
+          <w:rFonts w:ascii="Consolas" w:hAnsi="Consolas"/>
+        </w:rPr>
+        <w:t>": "</w:t>
+      </w:r>
+      <w:r>
+        <w:rPr>
+          <w:rFonts w:ascii="Consolas" w:hAnsi="Consolas"/>
+        </w:rPr>
+        <w:t>Amr</w:t>
+      </w:r>
+      <w:r>
+        <w:rPr>
+          <w:rFonts w:ascii="Consolas" w:hAnsi="Consolas"/>
+        </w:rPr>
+        <w:t>",</w:t>
+      </w:r>
+    </w:p>
+    <w:p>
+      <w:pPr>
+        <w:ind w:left="360"/>
+        <w:rPr>
+          <w:rFonts w:ascii="Consolas" w:hAnsi="Consolas"/>
+        </w:rPr>
+      </w:pPr>
+      <w:r>
+        <w:rPr>
+          <w:rFonts w:ascii="Consolas" w:hAnsi="Consolas"/>
+        </w:rPr>
+        <w:t xml:space="preserve">        "</w:t>
+      </w:r>
+      <w:proofErr w:type="spellStart"/>
+      <w:r>
+        <w:rPr>
+          <w:rFonts w:ascii="Consolas" w:hAnsi="Consolas"/>
+        </w:rPr>
+        <w:t>lastName</w:t>
+      </w:r>
+      <w:proofErr w:type="spellEnd"/>
+      <w:r>
+        <w:rPr>
+          <w:rFonts w:ascii="Consolas" w:hAnsi="Consolas"/>
+        </w:rPr>
+        <w:t>": "</w:t>
+      </w:r>
+      <w:r>
+        <w:rPr>
+          <w:rFonts w:ascii="Consolas" w:hAnsi="Consolas"/>
+        </w:rPr>
+        <w:t>Ashraf</w:t>
+      </w:r>
+      <w:r>
+        <w:rPr>
+          <w:rFonts w:ascii="Consolas" w:hAnsi="Consolas"/>
+        </w:rPr>
+        <w:t>",</w:t>
+      </w:r>
+    </w:p>
+    <w:p>
+      <w:pPr>
+        <w:ind w:left="360"/>
+        <w:rPr>
+          <w:rFonts w:ascii="Consolas" w:hAnsi="Consolas"/>
+        </w:rPr>
+      </w:pPr>
+      <w:r>
+        <w:rPr>
+          <w:rFonts w:ascii="Consolas" w:hAnsi="Consolas"/>
+        </w:rPr>
+        <w:t xml:space="preserve">        "</w:t>
+      </w:r>
+      <w:proofErr w:type="spellStart"/>
+      <w:r>
+        <w:rPr>
+          <w:rFonts w:ascii="Consolas" w:hAnsi="Consolas"/>
+        </w:rPr>
+        <w:t>phoneNumber</w:t>
+      </w:r>
+      <w:proofErr w:type="spellEnd"/>
+      <w:r>
+        <w:rPr>
+          <w:rFonts w:ascii="Consolas" w:hAnsi="Consolas"/>
+        </w:rPr>
+        <w:t>": "+201234567890",</w:t>
+      </w:r>
+    </w:p>
+    <w:p>
+      <w:pPr>
+        <w:ind w:left="360"/>
+        <w:rPr>
+          <w:rFonts w:ascii="Consolas" w:hAnsi="Consolas"/>
+        </w:rPr>
+      </w:pPr>
+      <w:r>
+        <w:rPr>
+          <w:rFonts w:ascii="Consolas" w:hAnsi="Consolas"/>
+        </w:rPr>
+        <w:t xml:space="preserve">        "address": "123 </w:t>
+      </w:r>
+      <w:r>
+        <w:rPr>
+          <w:rFonts w:ascii="Consolas" w:hAnsi="Consolas"/>
+        </w:rPr>
+        <w:t>Example</w:t>
+      </w:r>
+      <w:r>
+        <w:rPr>
+          <w:rFonts w:ascii="Consolas" w:hAnsi="Consolas"/>
+        </w:rPr>
+        <w:t xml:space="preserve"> St, Cairo"</w:t>
+      </w:r>
+    </w:p>
+    <w:p>
+      <w:pPr>
+        <w:ind w:left="360"/>
+        <w:rPr>
+          <w:rFonts w:ascii="Consolas" w:hAnsi="Consolas"/>
+        </w:rPr>
+      </w:pPr>
+      <w:r>
+        <w:rPr>
+          <w:rFonts w:ascii="Consolas" w:hAnsi="Consolas"/>
+        </w:rPr>
         <w:lastRenderedPageBreak/>
+        <w:t xml:space="preserve">    },</w:t>
+      </w:r>
+    </w:p>
+    <w:p>
+      <w:pPr>
+        <w:ind w:left="360"/>
+        <w:rPr>
+          <w:rFonts w:ascii="Consolas" w:hAnsi="Consolas"/>
+        </w:rPr>
+      </w:pPr>
+      <w:r>
+        <w:rPr>
+          <w:rFonts w:ascii="Consolas" w:hAnsi="Consolas"/>
+        </w:rPr>
+        <w:t xml:space="preserve">    "categories": ["plumbing", "electrical", "carpentry"],</w:t>
+      </w:r>
+    </w:p>
+    <w:p>
+      <w:pPr>
+        <w:ind w:left="360"/>
+        <w:rPr>
+          <w:rFonts w:ascii="Consolas" w:hAnsi="Consolas"/>
+        </w:rPr>
+      </w:pPr>
+      <w:r>
+        <w:rPr>
+          <w:rFonts w:ascii="Consolas" w:hAnsi="Consolas"/>
+        </w:rPr>
+        <w:t xml:space="preserve">    "status": "PENDING_VERIFICATION",</w:t>
+      </w:r>
+    </w:p>
+    <w:p>
+      <w:pPr>
+        <w:ind w:left="360"/>
+        <w:rPr>
+          <w:rFonts w:ascii="Consolas" w:hAnsi="Consolas"/>
+        </w:rPr>
+      </w:pPr>
+      <w:r>
+        <w:rPr>
+          <w:rFonts w:ascii="Consolas" w:hAnsi="Consolas"/>
+        </w:rPr>
+        <w:t xml:space="preserve">    </w:t>
+      </w:r>
+      <w:r>
+        <w:rPr>
+          <w:rFonts w:ascii="Consolas" w:hAnsi="Consolas"/>
+        </w:rPr>
+        <w:t xml:space="preserve"> "</w:t>
+      </w:r>
+      <w:proofErr w:type="spellStart"/>
+      <w:r>
+        <w:rPr>
+          <w:rFonts w:ascii="Consolas" w:hAnsi="Consolas"/>
+        </w:rPr>
+        <w:t>verification</w:t>
+      </w:r>
+      <w:r>
+        <w:rPr>
+          <w:rFonts w:ascii="Consolas" w:hAnsi="Consolas"/>
+        </w:rPr>
+        <w:t>Info</w:t>
+      </w:r>
+      <w:proofErr w:type="spellEnd"/>
+      <w:r>
+        <w:rPr>
+          <w:rFonts w:ascii="Consolas" w:hAnsi="Consolas"/>
+        </w:rPr>
+        <w:t>": {</w:t>
+      </w:r>
+    </w:p>
+    <w:p>
+      <w:pPr>
+        <w:ind w:left="360"/>
+        <w:rPr>
+          <w:rFonts w:ascii="Consolas" w:hAnsi="Consolas"/>
+        </w:rPr>
+      </w:pPr>
+      <w:r>
+        <w:rPr>
+          <w:rFonts w:ascii="Consolas" w:hAnsi="Consolas"/>
+        </w:rPr>
+        <w:t xml:space="preserve">        "status": "PENDING",</w:t>
+      </w:r>
+    </w:p>
+    <w:p>
+      <w:pPr>
+        <w:ind w:left="360"/>
+        <w:rPr>
+          <w:rFonts w:ascii="Consolas" w:hAnsi="Consolas"/>
+        </w:rPr>
+      </w:pPr>
+      <w:r>
+        <w:rPr>
+          <w:rFonts w:ascii="Consolas" w:hAnsi="Consolas"/>
+        </w:rPr>
+        <w:t xml:space="preserve">        "</w:t>
+      </w:r>
+      <w:proofErr w:type="spellStart"/>
+      <w:r>
+        <w:rPr>
+          <w:rFonts w:ascii="Consolas" w:hAnsi="Consolas"/>
+        </w:rPr>
+        <w:t>idCardFrontUrl</w:t>
+      </w:r>
+      <w:proofErr w:type="spellEnd"/>
+      <w:r>
+        <w:rPr>
+          <w:rFonts w:ascii="Consolas" w:hAnsi="Consolas"/>
+        </w:rPr>
+        <w:t>": "https://...",</w:t>
+      </w:r>
+    </w:p>
+    <w:p>
+      <w:pPr>
+        <w:ind w:left="360"/>
+        <w:rPr>
+          <w:rFonts w:ascii="Consolas" w:hAnsi="Consolas"/>
+        </w:rPr>
+      </w:pPr>
+      <w:r>
+        <w:rPr>
+          <w:rFonts w:ascii="Consolas" w:hAnsi="Consolas"/>
+        </w:rPr>
+        <w:t xml:space="preserve">        "</w:t>
+      </w:r>
+      <w:proofErr w:type="spellStart"/>
+      <w:r>
+        <w:rPr>
+          <w:rFonts w:ascii="Consolas" w:hAnsi="Consolas"/>
+        </w:rPr>
+        <w:t>idCardBackUrl</w:t>
+      </w:r>
+      <w:proofErr w:type="spellEnd"/>
+      <w:r>
+        <w:rPr>
+          <w:rFonts w:ascii="Consolas" w:hAnsi="Consolas"/>
+        </w:rPr>
+        <w:t>": "https://...",</w:t>
+      </w:r>
+    </w:p>
+    <w:p>
+      <w:pPr>
+        <w:ind w:left="360"/>
+        <w:rPr>
+          <w:rFonts w:ascii="Consolas" w:hAnsi="Consolas"/>
+        </w:rPr>
+      </w:pPr>
+      <w:r>
+        <w:rPr>
+          <w:rFonts w:ascii="Consolas" w:hAnsi="Consolas"/>
+        </w:rPr>
+        <w:t xml:space="preserve">        "</w:t>
+      </w:r>
+      <w:proofErr w:type="spellStart"/>
+      <w:r>
+        <w:rPr>
+          <w:rFonts w:ascii="Consolas" w:hAnsi="Consolas"/>
+        </w:rPr>
+        <w:t>workPortfolioUrls</w:t>
+      </w:r>
+      <w:proofErr w:type="spellEnd"/>
+      <w:r>
+        <w:rPr>
+          <w:rFonts w:ascii="Consolas" w:hAnsi="Consolas"/>
+        </w:rPr>
+        <w:t>": ["https://...", "https://..."]</w:t>
+      </w:r>
+      <w:r>
+        <w:rPr>
+          <w:rFonts w:ascii="Consolas" w:hAnsi="Consolas"/>
+        </w:rPr>
+        <w:t xml:space="preserve">    "</w:t>
+      </w:r>
+      <w:proofErr w:type="spellStart"/>
+      <w:r>
+        <w:rPr>
+          <w:rFonts w:ascii="Consolas" w:hAnsi="Consolas"/>
+        </w:rPr>
+        <w:t>createdAt</w:t>
+      </w:r>
+      <w:proofErr w:type="spellEnd"/>
+      <w:r>
+        <w:rPr>
+          <w:rFonts w:ascii="Consolas" w:hAnsi="Consolas"/>
+        </w:rPr>
+        <w:t>": "2024-11-21T10:30:00Z"</w:t>
+      </w:r>
+    </w:p>
+    <w:p>
+      <w:pPr>
+        <w:ind w:left="360"/>
+        <w:rPr>
+          <w:rFonts w:ascii="Consolas" w:hAnsi="Consolas"/>
+        </w:rPr>
+      </w:pPr>
+      <w:r>
+        <w:rPr>
+          <w:rFonts w:ascii="Consolas" w:hAnsi="Consolas"/>
+        </w:rPr>
+        <w:t>}</w:t>
+      </w:r>
+    </w:p>
+    <w:p>
+      <w:pPr>
+        <w:pStyle w:val="Heading3"/>
+      </w:pPr>
+      <w:r>
+        <w:t>Error Response</w:t>
+      </w:r>
+    </w:p>
+    <w:p>
+      <w:pPr>
+        <w:ind w:firstLine="360"/>
+      </w:pPr>
+      <w:r>
+        <w:t>404 Not Found - No craftsman profile exists for this user</w:t>
+      </w:r>
+    </w:p>
+    <w:p/>
+    <w:p>
+      <w:pPr>
+        <w:pStyle w:val="Heading2"/>
+      </w:pPr>
+      <w:r>
+        <w:t>Get Craftsman Status</w:t>
+      </w:r>
+    </w:p>
+    <w:p>
+      <w:r>
+        <w:t>Checks the verification status of a specific craftsman.</w:t>
+      </w:r>
+    </w:p>
+    <w:p>
+      <w:r>
+        <w:t>Type: GET</w:t>
+      </w:r>
+    </w:p>
+    <w:p>
+      <w:r>
+        <w:t>Endpoint: {</w:t>
+      </w:r>
+      <w:proofErr w:type="spellStart"/>
+      <w:r>
+        <w:t>BaseURL</w:t>
+      </w:r>
+      <w:proofErr w:type="spellEnd"/>
+      <w:r>
+        <w:t>}/craftsman/{</w:t>
+      </w:r>
+      <w:proofErr w:type="spellStart"/>
+      <w:r>
+        <w:t>craftsmanId</w:t>
+      </w:r>
+      <w:proofErr w:type="spellEnd"/>
+      <w:r>
+        <w:t>}/status</w:t>
+      </w:r>
+    </w:p>
+    <w:p>
+      <w:pPr>
+        <w:pStyle w:val="Heading3"/>
+      </w:pPr>
+      <w:r>
+        <w:t>Path Parameters</w:t>
+      </w:r>
+    </w:p>
+    <w:p>
+      <w:pPr>
+        <w:ind w:firstLine="360"/>
+      </w:pPr>
+      <w:proofErr w:type="spellStart"/>
+      <w:r>
+        <w:t>craftsmanId</w:t>
+      </w:r>
+      <w:proofErr w:type="spellEnd"/>
+      <w:r>
+        <w:t xml:space="preserve"> - The craftsman's ID</w:t>
+      </w:r>
+    </w:p>
+    <w:p>
+      <w:pPr>
+        <w:pStyle w:val="Heading3"/>
+      </w:pPr>
+      <w:r>
+        <w:t>Response (200 OK)</w:t>
+      </w:r>
+    </w:p>
+    <w:p>
+      <w:pPr>
+        <w:ind w:left="360"/>
+        <w:rPr>
+          <w:rFonts w:ascii="Consolas" w:hAnsi="Consolas"/>
+        </w:rPr>
+      </w:pPr>
+      <w:proofErr w:type="spellStart"/>
+      <w:r>
+        <w:rPr>
+          <w:rFonts w:ascii="Consolas" w:hAnsi="Consolas"/>
+        </w:rPr>
+        <w:t>json</w:t>
+      </w:r>
+      <w:proofErr w:type="spellEnd"/>
+    </w:p>
+    <w:p>
+      <w:pPr>
+        <w:ind w:left="360"/>
+        <w:rPr>
+          <w:rFonts w:ascii="Consolas" w:hAnsi="Consolas"/>
+        </w:rPr>
+      </w:pPr>
+      <w:r>
+        <w:rPr>
+          <w:rFonts w:ascii="Consolas" w:hAnsi="Consolas"/>
+        </w:rPr>
         <w:t>{</w:t>
       </w:r>
     </w:p>
@@ -1659,6 +2609,20 @@
         <w:rPr>
           <w:rFonts w:ascii="Consolas" w:hAnsi="Consolas"/>
         </w:rPr>
+        <w:t xml:space="preserve">    "status": "PENDING_VERIFICATION",</w:t>
+      </w:r>
+    </w:p>
+    <w:p>
+      <w:pPr>
+        <w:ind w:left="360"/>
+        <w:rPr>
+          <w:rFonts w:ascii="Consolas" w:hAnsi="Consolas"/>
+        </w:rPr>
+      </w:pPr>
+      <w:r>
+        <w:rPr>
+          <w:rFonts w:ascii="Consolas" w:hAnsi="Consolas"/>
+        </w:rPr>
         <w:t xml:space="preserve">    "</w:t>
       </w:r>
       <w:proofErr w:type="spellStart"/>
@@ -1666,847 +2630,314 @@
         <w:rPr>
           <w:rFonts w:ascii="Consolas" w:hAnsi="Consolas"/>
         </w:rPr>
-        <w:t>personalInfo</w:t>
+        <w:t>verificationStatus</w:t>
       </w:r>
       <w:proofErr w:type="spellEnd"/>
       <w:r>
         <w:rPr>
           <w:rFonts w:ascii="Consolas" w:hAnsi="Consolas"/>
         </w:rPr>
-        <w:t>": {</w:t>
-      </w:r>
-    </w:p>
-    <w:p>
-      <w:pPr>
-        <w:ind w:left="360"/>
-        <w:rPr>
-          <w:rFonts w:ascii="Consolas" w:hAnsi="Consolas"/>
-        </w:rPr>
-      </w:pPr>
-      <w:r>
-        <w:rPr>
-          <w:rFonts w:ascii="Consolas" w:hAnsi="Consolas"/>
-        </w:rPr>
-        <w:t xml:space="preserve">        "</w:t>
+        <w:t>": "PENDING",</w:t>
+      </w:r>
+    </w:p>
+    <w:p>
+      <w:pPr>
+        <w:ind w:left="360"/>
+        <w:rPr>
+          <w:rFonts w:ascii="Consolas" w:hAnsi="Consolas"/>
+        </w:rPr>
+      </w:pPr>
+      <w:r>
+        <w:rPr>
+          <w:rFonts w:ascii="Consolas" w:hAnsi="Consolas"/>
+        </w:rPr>
+        <w:t xml:space="preserve">    "message": "Profile pending verification"</w:t>
+      </w:r>
+    </w:p>
+    <w:p>
+      <w:pPr>
+        <w:ind w:left="360"/>
+      </w:pPr>
+      <w:r>
+        <w:rPr>
+          <w:rFonts w:ascii="Consolas" w:hAnsi="Consolas"/>
+        </w:rPr>
+        <w:t>}</w:t>
+      </w:r>
+    </w:p>
+    <w:p>
+      <w:pPr>
+        <w:pStyle w:val="Heading3"/>
+      </w:pPr>
+      <w:r>
+        <w:lastRenderedPageBreak/>
+        <w:t>Possible Status Values</w:t>
+      </w:r>
+    </w:p>
+    <w:p>
+      <w:pPr>
+        <w:ind w:left="360"/>
+      </w:pPr>
+      <w:r>
+        <w:t>PENDING_VERIFICATION - Awaiting admin review</w:t>
+      </w:r>
+    </w:p>
+    <w:p>
+      <w:pPr>
+        <w:ind w:left="360"/>
+      </w:pPr>
+      <w:r>
+        <w:t>ACTIVE - Verified and active</w:t>
+      </w:r>
+    </w:p>
+    <w:p>
+      <w:pPr>
+        <w:ind w:left="360"/>
+      </w:pPr>
+      <w:r>
+        <w:t>SUSPENDED - Temporarily suspended</w:t>
+      </w:r>
+    </w:p>
+    <w:p>
+      <w:pPr>
+        <w:ind w:left="360"/>
+      </w:pPr>
+      <w:r>
+        <w:t>REJECTED - Application rejected</w:t>
+      </w:r>
+    </w:p>
+    <w:p>
+      <w:pPr>
+        <w:pStyle w:val="Heading3"/>
+      </w:pPr>
+      <w:r>
+        <w:t>Possible Verification Status Values</w:t>
+      </w:r>
+    </w:p>
+    <w:p>
+      <w:pPr>
+        <w:ind w:left="360"/>
+      </w:pPr>
+      <w:r>
+        <w:t>NOT_SUBMITTED - Documents not uploaded</w:t>
+      </w:r>
+    </w:p>
+    <w:p>
+      <w:pPr>
+        <w:ind w:left="360"/>
+      </w:pPr>
+      <w:r>
+        <w:t>PENDING - Documents uploaded, awaiting review</w:t>
+      </w:r>
+    </w:p>
+    <w:p>
+      <w:pPr>
+        <w:ind w:left="360"/>
+      </w:pPr>
+      <w:r>
+        <w:t>VERIFIED - Documents verified</w:t>
+      </w:r>
+    </w:p>
+    <w:p>
+      <w:pPr>
+        <w:ind w:left="360"/>
+      </w:pPr>
+      <w:r>
+        <w:t>REJECTED - Documents rejected</w:t>
+      </w:r>
+    </w:p>
+    <w:p/>
+    <w:p>
+      <w:pPr>
+        <w:pStyle w:val="Heading2"/>
+        <w:rPr>
+          <w:highlight w:val="yellow"/>
+        </w:rPr>
+      </w:pPr>
+      <w:r>
+        <w:rPr>
+          <w:highlight w:val="yellow"/>
+        </w:rPr>
+        <w:t>Delete Craftsman Account</w:t>
+      </w:r>
+    </w:p>
+    <w:p>
+      <w:r>
+        <w:t>Deletes craftsman account and all associated files.</w:t>
+      </w:r>
+    </w:p>
+    <w:p>
+      <w:r>
+        <w:t>Type: DELETE</w:t>
+      </w:r>
+    </w:p>
+    <w:p>
+      <w:r>
+        <w:t>Endpoint: {</w:t>
       </w:r>
       <w:proofErr w:type="spellStart"/>
       <w:r>
-        <w:rPr>
-          <w:rFonts w:ascii="Consolas" w:hAnsi="Consolas"/>
-        </w:rPr>
-        <w:t>firstName</w:t>
+        <w:t>BaseURL</w:t>
       </w:r>
       <w:proofErr w:type="spellEnd"/>
       <w:r>
-        <w:rPr>
-          <w:rFonts w:ascii="Consolas" w:hAnsi="Consolas"/>
-        </w:rPr>
-        <w:t>": "</w:t>
-      </w:r>
-      <w:r>
-        <w:rPr>
-          <w:rFonts w:ascii="Consolas" w:hAnsi="Consolas"/>
-        </w:rPr>
-        <w:t>Amr</w:t>
-      </w:r>
-      <w:r>
-        <w:rPr>
-          <w:rFonts w:ascii="Consolas" w:hAnsi="Consolas"/>
-        </w:rPr>
-        <w:t>",</w:t>
-      </w:r>
-    </w:p>
-    <w:p>
-      <w:pPr>
-        <w:ind w:left="360"/>
-        <w:rPr>
-          <w:rFonts w:ascii="Consolas" w:hAnsi="Consolas"/>
-        </w:rPr>
-      </w:pPr>
-      <w:r>
-        <w:rPr>
-          <w:rFonts w:ascii="Consolas" w:hAnsi="Consolas"/>
-        </w:rPr>
-        <w:t xml:space="preserve">        "</w:t>
+        <w:t>}/craftsman/{</w:t>
       </w:r>
       <w:proofErr w:type="spellStart"/>
       <w:r>
-        <w:rPr>
-          <w:rFonts w:ascii="Consolas" w:hAnsi="Consolas"/>
-        </w:rPr>
-        <w:t>lastName</w:t>
+        <w:t>craftsmanId</w:t>
       </w:r>
       <w:proofErr w:type="spellEnd"/>
       <w:r>
-        <w:rPr>
-          <w:rFonts w:ascii="Consolas" w:hAnsi="Consolas"/>
-        </w:rPr>
-        <w:t>": "</w:t>
-      </w:r>
-      <w:r>
-        <w:rPr>
-          <w:rFonts w:ascii="Consolas" w:hAnsi="Consolas"/>
-        </w:rPr>
-        <w:t>Ashraf</w:t>
-      </w:r>
-      <w:r>
-        <w:rPr>
-          <w:rFonts w:ascii="Consolas" w:hAnsi="Consolas"/>
-        </w:rPr>
-        <w:t>",</w:t>
-      </w:r>
-    </w:p>
-    <w:p>
-      <w:pPr>
-        <w:ind w:left="360"/>
-        <w:rPr>
-          <w:rFonts w:ascii="Consolas" w:hAnsi="Consolas"/>
-        </w:rPr>
-      </w:pPr>
-      <w:r>
-        <w:rPr>
-          <w:rFonts w:ascii="Consolas" w:hAnsi="Consolas"/>
-        </w:rPr>
-        <w:t xml:space="preserve">        "</w:t>
-      </w:r>
+        <w:t>}</w:t>
+      </w:r>
+    </w:p>
+    <w:p>
+      <w:pPr>
+        <w:pStyle w:val="Heading3"/>
+      </w:pPr>
+      <w:r>
+        <w:t>Headers</w:t>
+      </w:r>
+    </w:p>
+    <w:p>
+      <w:pPr>
+        <w:ind w:firstLine="360"/>
+      </w:pPr>
       <w:proofErr w:type="spellStart"/>
       <w:r>
-        <w:rPr>
-          <w:rFonts w:ascii="Consolas" w:hAnsi="Consolas"/>
-        </w:rPr>
-        <w:t>phoneNumber</w:t>
+        <w:t>userId</w:t>
       </w:r>
       <w:proofErr w:type="spellEnd"/>
       <w:r>
-        <w:rPr>
-          <w:rFonts w:ascii="Consolas" w:hAnsi="Consolas"/>
-        </w:rPr>
-        <w:t>": "+201234567890",</w:t>
-      </w:r>
-    </w:p>
-    <w:p>
-      <w:pPr>
-        <w:ind w:left="360"/>
-        <w:rPr>
-          <w:rFonts w:ascii="Consolas" w:hAnsi="Consolas"/>
-        </w:rPr>
-      </w:pPr>
-      <w:r>
-        <w:rPr>
-          <w:rFonts w:ascii="Consolas" w:hAnsi="Consolas"/>
-        </w:rPr>
-        <w:t xml:space="preserve">        "address": "123 </w:t>
-      </w:r>
-      <w:r>
-        <w:rPr>
-          <w:rFonts w:ascii="Consolas" w:hAnsi="Consolas"/>
-        </w:rPr>
-        <w:t>Example</w:t>
-      </w:r>
-      <w:r>
-        <w:rPr>
-          <w:rFonts w:ascii="Consolas" w:hAnsi="Consolas"/>
-        </w:rPr>
-        <w:t xml:space="preserve"> St, Cairo"</w:t>
-      </w:r>
-    </w:p>
-    <w:p>
-      <w:pPr>
-        <w:ind w:left="360"/>
-        <w:rPr>
-          <w:rFonts w:ascii="Consolas" w:hAnsi="Consolas"/>
-        </w:rPr>
-      </w:pPr>
-      <w:r>
-        <w:rPr>
-          <w:rFonts w:ascii="Consolas" w:hAnsi="Consolas"/>
-        </w:rPr>
-        <w:t xml:space="preserve">    },</w:t>
-      </w:r>
-    </w:p>
-    <w:p>
-      <w:pPr>
-        <w:ind w:left="360"/>
-        <w:rPr>
-          <w:rFonts w:ascii="Consolas" w:hAnsi="Consolas"/>
-        </w:rPr>
-      </w:pPr>
-      <w:r>
-        <w:rPr>
-          <w:rFonts w:ascii="Consolas" w:hAnsi="Consolas"/>
-        </w:rPr>
-        <w:t xml:space="preserve">    "categories": ["plumbing", "electrical", "carpentry"],</w:t>
-      </w:r>
-    </w:p>
-    <w:p>
-      <w:pPr>
-        <w:ind w:left="360"/>
-        <w:rPr>
-          <w:rFonts w:ascii="Consolas" w:hAnsi="Consolas"/>
-        </w:rPr>
-      </w:pPr>
-      <w:r>
-        <w:rPr>
-          <w:rFonts w:ascii="Consolas" w:hAnsi="Consolas"/>
-        </w:rPr>
-        <w:t xml:space="preserve">    "status": "PENDING_VERIFICATION",</w:t>
-      </w:r>
-    </w:p>
-    <w:p>
-      <w:pPr>
-        <w:ind w:left="360"/>
-        <w:rPr>
-          <w:rFonts w:ascii="Consolas" w:hAnsi="Consolas"/>
-        </w:rPr>
-      </w:pPr>
-      <w:r>
-        <w:rPr>
-          <w:rFonts w:ascii="Consolas" w:hAnsi="Consolas"/>
-        </w:rPr>
-        <w:t xml:space="preserve">    </w:t>
-      </w:r>
-      <w:r>
-        <w:rPr>
-          <w:rFonts w:ascii="Consolas" w:hAnsi="Consolas"/>
-        </w:rPr>
-        <w:t xml:space="preserve"> "</w:t>
-      </w:r>
+        <w:t>: user123</w:t>
+      </w:r>
+    </w:p>
+    <w:p>
+      <w:pPr>
+        <w:pStyle w:val="Heading3"/>
+      </w:pPr>
+      <w:r>
+        <w:t>Response (200 OK)</w:t>
+      </w:r>
+    </w:p>
+    <w:p>
+      <w:pPr>
+        <w:ind w:left="360"/>
+        <w:rPr>
+          <w:rFonts w:ascii="Consolas" w:hAnsi="Consolas"/>
+        </w:rPr>
+      </w:pPr>
       <w:proofErr w:type="spellStart"/>
       <w:r>
         <w:rPr>
           <w:rFonts w:ascii="Consolas" w:hAnsi="Consolas"/>
         </w:rPr>
-        <w:t>verification</w:t>
-      </w:r>
-      <w:r>
-        <w:rPr>
-          <w:rFonts w:ascii="Consolas" w:hAnsi="Consolas"/>
-        </w:rPr>
-        <w:t>Info</w:t>
+        <w:t>json</w:t>
       </w:r>
       <w:proofErr w:type="spellEnd"/>
-      <w:r>
-        <w:rPr>
-          <w:rFonts w:ascii="Consolas" w:hAnsi="Consolas"/>
-        </w:rPr>
-        <w:t>": {</w:t>
-      </w:r>
-    </w:p>
-    <w:p>
-      <w:pPr>
-        <w:ind w:left="360"/>
-        <w:rPr>
-          <w:rFonts w:ascii="Consolas" w:hAnsi="Consolas"/>
-        </w:rPr>
-      </w:pPr>
-      <w:r>
-        <w:rPr>
-          <w:rFonts w:ascii="Consolas" w:hAnsi="Consolas"/>
-        </w:rPr>
-        <w:t xml:space="preserve">        "status": "PENDING",</w:t>
-      </w:r>
-    </w:p>
-    <w:p>
-      <w:pPr>
-        <w:ind w:left="360"/>
-        <w:rPr>
-          <w:rFonts w:ascii="Consolas" w:hAnsi="Consolas"/>
-        </w:rPr>
-      </w:pPr>
-      <w:r>
-        <w:rPr>
-          <w:rFonts w:ascii="Consolas" w:hAnsi="Consolas"/>
-        </w:rPr>
-        <w:t xml:space="preserve">        "</w:t>
-      </w:r>
+    </w:p>
+    <w:p>
+      <w:pPr>
+        <w:ind w:left="360"/>
+        <w:rPr>
+          <w:rFonts w:ascii="Consolas" w:hAnsi="Consolas"/>
+        </w:rPr>
+      </w:pPr>
+      <w:r>
+        <w:rPr>
+          <w:rFonts w:ascii="Consolas" w:hAnsi="Consolas"/>
+        </w:rPr>
+        <w:t>{</w:t>
+      </w:r>
+    </w:p>
+    <w:p>
+      <w:pPr>
+        <w:ind w:left="360"/>
+        <w:rPr>
+          <w:rFonts w:ascii="Consolas" w:hAnsi="Consolas"/>
+        </w:rPr>
+      </w:pPr>
+      <w:r>
+        <w:rPr>
+          <w:rFonts w:ascii="Consolas" w:hAnsi="Consolas"/>
+        </w:rPr>
+        <w:t xml:space="preserve">    "success": true,</w:t>
+      </w:r>
+    </w:p>
+    <w:p>
+      <w:pPr>
+        <w:ind w:left="360"/>
+        <w:rPr>
+          <w:rFonts w:ascii="Consolas" w:hAnsi="Consolas"/>
+        </w:rPr>
+      </w:pPr>
+      <w:r>
+        <w:rPr>
+          <w:rFonts w:ascii="Consolas" w:hAnsi="Consolas"/>
+        </w:rPr>
+        <w:t xml:space="preserve">    "message": "Craftsman account deleted successfully"</w:t>
+      </w:r>
+    </w:p>
+    <w:p>
+      <w:pPr>
+        <w:ind w:left="360"/>
+      </w:pPr>
+      <w:r>
+        <w:rPr>
+          <w:rFonts w:ascii="Consolas" w:hAnsi="Consolas"/>
+        </w:rPr>
+        <w:t>}</w:t>
+      </w:r>
+    </w:p>
+    <w:p>
+      <w:pPr>
+        <w:pStyle w:val="Heading3"/>
+      </w:pPr>
+      <w:r>
+        <w:t>Common Error Response Format</w:t>
+      </w:r>
+    </w:p>
+    <w:p>
+      <w:pPr>
+        <w:ind w:left="360"/>
+      </w:pPr>
       <w:proofErr w:type="spellStart"/>
       <w:r>
-        <w:rPr>
-          <w:rFonts w:ascii="Consolas" w:hAnsi="Consolas"/>
-        </w:rPr>
-        <w:t>idCardFrontUrl</w:t>
+        <w:t>json</w:t>
       </w:r>
       <w:proofErr w:type="spellEnd"/>
-      <w:r>
-        <w:rPr>
-          <w:rFonts w:ascii="Consolas" w:hAnsi="Consolas"/>
-        </w:rPr>
-        <w:t>": "https://...",</w:t>
-      </w:r>
-    </w:p>
-    <w:p>
-      <w:pPr>
-        <w:ind w:left="360"/>
-        <w:rPr>
-          <w:rFonts w:ascii="Consolas" w:hAnsi="Consolas"/>
-        </w:rPr>
-      </w:pPr>
-      <w:r>
-        <w:rPr>
-          <w:rFonts w:ascii="Consolas" w:hAnsi="Consolas"/>
-        </w:rPr>
-        <w:t xml:space="preserve">        "</w:t>
-      </w:r>
-      <w:proofErr w:type="spellStart"/>
-      <w:r>
-        <w:rPr>
-          <w:rFonts w:ascii="Consolas" w:hAnsi="Consolas"/>
-        </w:rPr>
-        <w:t>idCardBackUrl</w:t>
-      </w:r>
-      <w:proofErr w:type="spellEnd"/>
-      <w:r>
-        <w:rPr>
-          <w:rFonts w:ascii="Consolas" w:hAnsi="Consolas"/>
-        </w:rPr>
-        <w:t>": "https://...",</w:t>
-      </w:r>
-    </w:p>
-    <w:p>
-      <w:pPr>
-        <w:ind w:left="360"/>
-        <w:rPr>
-          <w:rFonts w:ascii="Consolas" w:hAnsi="Consolas"/>
-        </w:rPr>
-      </w:pPr>
-      <w:r>
-        <w:rPr>
-          <w:rFonts w:ascii="Consolas" w:hAnsi="Consolas"/>
-        </w:rPr>
-        <w:t xml:space="preserve">        "</w:t>
-      </w:r>
-      <w:proofErr w:type="spellStart"/>
-      <w:r>
-        <w:rPr>
-          <w:rFonts w:ascii="Consolas" w:hAnsi="Consolas"/>
-        </w:rPr>
-        <w:t>workPortfolioUrls</w:t>
-      </w:r>
-      <w:proofErr w:type="spellEnd"/>
-      <w:r>
-        <w:rPr>
-          <w:rFonts w:ascii="Consolas" w:hAnsi="Consolas"/>
-        </w:rPr>
-        <w:t>": ["https://...", "https://..."]</w:t>
-      </w:r>
-      <w:r>
-        <w:rPr>
-          <w:rFonts w:ascii="Consolas" w:hAnsi="Consolas"/>
-        </w:rPr>
-        <w:t xml:space="preserve">    "</w:t>
-      </w:r>
-      <w:proofErr w:type="spellStart"/>
-      <w:r>
-        <w:rPr>
-          <w:rFonts w:ascii="Consolas" w:hAnsi="Consolas"/>
-        </w:rPr>
-        <w:t>createdAt</w:t>
-      </w:r>
-      <w:proofErr w:type="spellEnd"/>
-      <w:r>
-        <w:rPr>
-          <w:rFonts w:ascii="Consolas" w:hAnsi="Consolas"/>
-        </w:rPr>
-        <w:t>": "2024-11-21T10:30:00Z"</w:t>
-      </w:r>
-    </w:p>
-    <w:p>
-      <w:pPr>
-        <w:ind w:left="360"/>
-        <w:rPr>
-          <w:rFonts w:ascii="Consolas" w:hAnsi="Consolas"/>
-        </w:rPr>
-      </w:pPr>
-      <w:r>
-        <w:rPr>
-          <w:rFonts w:ascii="Consolas" w:hAnsi="Consolas"/>
-        </w:rPr>
-        <w:t>}</w:t>
-      </w:r>
-    </w:p>
-    <w:p>
-      <w:pPr>
-        <w:pStyle w:val="Heading3"/>
-      </w:pPr>
-      <w:r>
-        <w:t>Error Response</w:t>
-      </w:r>
-    </w:p>
-    <w:p>
-      <w:pPr>
-        <w:ind w:firstLine="360"/>
-      </w:pPr>
-      <w:r>
-        <w:t>404 Not Found - No craftsman profile exists for this user</w:t>
-      </w:r>
-    </w:p>
-    <w:p/>
-    <w:p>
-      <w:pPr>
-        <w:pStyle w:val="Heading2"/>
-      </w:pPr>
-      <w:r>
-        <w:t>Get Craftsman Status</w:t>
-      </w:r>
-    </w:p>
-    <w:p>
-      <w:r>
-        <w:t>Checks the verification status of a specific craftsman.</w:t>
-      </w:r>
-    </w:p>
-    <w:p>
-      <w:r>
-        <w:t>Type: GET</w:t>
-      </w:r>
-    </w:p>
-    <w:p>
-      <w:r>
-        <w:t>Endpoint: {</w:t>
-      </w:r>
-      <w:proofErr w:type="spellStart"/>
-      <w:r>
-        <w:t>BaseURL</w:t>
-      </w:r>
-      <w:proofErr w:type="spellEnd"/>
-      <w:r>
-        <w:t>}/craftsman/{</w:t>
-      </w:r>
-      <w:proofErr w:type="spellStart"/>
-      <w:r>
-        <w:t>craftsmanId</w:t>
-      </w:r>
-      <w:proofErr w:type="spellEnd"/>
-      <w:r>
-        <w:t>}/status</w:t>
-      </w:r>
-    </w:p>
-    <w:p>
-      <w:pPr>
-        <w:pStyle w:val="Heading3"/>
-      </w:pPr>
-      <w:r>
-        <w:t>Path Parameters</w:t>
-      </w:r>
-    </w:p>
-    <w:p>
-      <w:pPr>
-        <w:ind w:firstLine="360"/>
-      </w:pPr>
-      <w:proofErr w:type="spellStart"/>
-      <w:r>
-        <w:t>craftsmanId</w:t>
-      </w:r>
-      <w:proofErr w:type="spellEnd"/>
-      <w:r>
-        <w:t xml:space="preserve"> - The craftsman's ID</w:t>
-      </w:r>
-    </w:p>
-    <w:p>
-      <w:pPr>
-        <w:pStyle w:val="Heading3"/>
-      </w:pPr>
-      <w:r>
-        <w:t>Response (200 OK)</w:t>
-      </w:r>
-    </w:p>
-    <w:p>
-      <w:pPr>
-        <w:ind w:left="360"/>
-        <w:rPr>
-          <w:rFonts w:ascii="Consolas" w:hAnsi="Consolas"/>
-        </w:rPr>
-      </w:pPr>
-      <w:proofErr w:type="spellStart"/>
-      <w:r>
-        <w:rPr>
-          <w:rFonts w:ascii="Consolas" w:hAnsi="Consolas"/>
-        </w:rPr>
-        <w:t>json</w:t>
-      </w:r>
-      <w:proofErr w:type="spellEnd"/>
-    </w:p>
-    <w:p>
-      <w:pPr>
-        <w:ind w:left="360"/>
-        <w:rPr>
-          <w:rFonts w:ascii="Consolas" w:hAnsi="Consolas"/>
-        </w:rPr>
-      </w:pPr>
-      <w:r>
-        <w:rPr>
-          <w:rFonts w:ascii="Consolas" w:hAnsi="Consolas"/>
-        </w:rPr>
+    </w:p>
+    <w:p>
+      <w:pPr>
+        <w:ind w:left="360"/>
+      </w:pPr>
+      <w:r>
+        <w:t>{</w:t>
+      </w:r>
+    </w:p>
+    <w:p>
+      <w:pPr>
+        <w:ind w:left="360"/>
+      </w:pPr>
+      <w:r>
+        <w:t xml:space="preserve">    "code": "ERROR_CODE",</w:t>
+      </w:r>
+    </w:p>
+    <w:p>
+      <w:pPr>
+        <w:ind w:left="360"/>
+      </w:pPr>
+      <w:r>
+        <w:t xml:space="preserve">    "message": "Human readable error message",</w:t>
+      </w:r>
+    </w:p>
+    <w:p>
+      <w:pPr>
+        <w:ind w:left="360"/>
+      </w:pPr>
+      <w:r>
         <w:lastRenderedPageBreak/>
-        <w:t>{</w:t>
-      </w:r>
-    </w:p>
-    <w:p>
-      <w:pPr>
-        <w:ind w:left="360"/>
-        <w:rPr>
-          <w:rFonts w:ascii="Consolas" w:hAnsi="Consolas"/>
-        </w:rPr>
-      </w:pPr>
-      <w:r>
-        <w:rPr>
-          <w:rFonts w:ascii="Consolas" w:hAnsi="Consolas"/>
-        </w:rPr>
-        <w:t xml:space="preserve">    "</w:t>
-      </w:r>
-      <w:proofErr w:type="spellStart"/>
-      <w:r>
-        <w:rPr>
-          <w:rFonts w:ascii="Consolas" w:hAnsi="Consolas"/>
-        </w:rPr>
-        <w:t>craftsmanId</w:t>
-      </w:r>
-      <w:proofErr w:type="spellEnd"/>
-      <w:r>
-        <w:rPr>
-          <w:rFonts w:ascii="Consolas" w:hAnsi="Consolas"/>
-        </w:rPr>
-        <w:t>": "673f5a1234567890abcdef12",</w:t>
-      </w:r>
-    </w:p>
-    <w:p>
-      <w:pPr>
-        <w:ind w:left="360"/>
-        <w:rPr>
-          <w:rFonts w:ascii="Consolas" w:hAnsi="Consolas"/>
-        </w:rPr>
-      </w:pPr>
-      <w:r>
-        <w:rPr>
-          <w:rFonts w:ascii="Consolas" w:hAnsi="Consolas"/>
-        </w:rPr>
-        <w:t xml:space="preserve">    "status": "PENDING_VERIFICATION",</w:t>
-      </w:r>
-    </w:p>
-    <w:p>
-      <w:pPr>
-        <w:ind w:left="360"/>
-        <w:rPr>
-          <w:rFonts w:ascii="Consolas" w:hAnsi="Consolas"/>
-        </w:rPr>
-      </w:pPr>
-      <w:r>
-        <w:rPr>
-          <w:rFonts w:ascii="Consolas" w:hAnsi="Consolas"/>
-        </w:rPr>
-        <w:t xml:space="preserve">    "</w:t>
-      </w:r>
-      <w:proofErr w:type="spellStart"/>
-      <w:r>
-        <w:rPr>
-          <w:rFonts w:ascii="Consolas" w:hAnsi="Consolas"/>
-        </w:rPr>
-        <w:t>verificationStatus</w:t>
-      </w:r>
-      <w:proofErr w:type="spellEnd"/>
-      <w:r>
-        <w:rPr>
-          <w:rFonts w:ascii="Consolas" w:hAnsi="Consolas"/>
-        </w:rPr>
-        <w:t>": "PENDING",</w:t>
-      </w:r>
-    </w:p>
-    <w:p>
-      <w:pPr>
-        <w:ind w:left="360"/>
-        <w:rPr>
-          <w:rFonts w:ascii="Consolas" w:hAnsi="Consolas"/>
-        </w:rPr>
-      </w:pPr>
-      <w:r>
-        <w:rPr>
-          <w:rFonts w:ascii="Consolas" w:hAnsi="Consolas"/>
-        </w:rPr>
-        <w:t xml:space="preserve">    "message": "Profile pending verification"</w:t>
-      </w:r>
-    </w:p>
-    <w:p>
-      <w:pPr>
-        <w:ind w:left="360"/>
-      </w:pPr>
-      <w:r>
-        <w:rPr>
-          <w:rFonts w:ascii="Consolas" w:hAnsi="Consolas"/>
-        </w:rPr>
-        <w:t>}</w:t>
-      </w:r>
-    </w:p>
-    <w:p>
-      <w:pPr>
-        <w:pStyle w:val="Heading3"/>
-      </w:pPr>
-      <w:r>
-        <w:t>Possible Status Values</w:t>
-      </w:r>
-    </w:p>
-    <w:p>
-      <w:pPr>
-        <w:ind w:left="360"/>
-      </w:pPr>
-      <w:r>
-        <w:t>PENDING_VERIFICATION - Awaiting admin review</w:t>
-      </w:r>
-    </w:p>
-    <w:p>
-      <w:pPr>
-        <w:ind w:left="360"/>
-      </w:pPr>
-      <w:r>
-        <w:t>ACTIVE - Verified and active</w:t>
-      </w:r>
-    </w:p>
-    <w:p>
-      <w:pPr>
-        <w:ind w:left="360"/>
-      </w:pPr>
-      <w:r>
-        <w:t>SUSPENDED - Temporarily suspended</w:t>
-      </w:r>
-    </w:p>
-    <w:p>
-      <w:pPr>
-        <w:ind w:left="360"/>
-      </w:pPr>
-      <w:r>
-        <w:t>REJECTED - Application rejected</w:t>
-      </w:r>
-    </w:p>
-    <w:p>
-      <w:pPr>
-        <w:pStyle w:val="Heading3"/>
-      </w:pPr>
-      <w:r>
-        <w:t>Possible Verification Status Values</w:t>
-      </w:r>
-    </w:p>
-    <w:p>
-      <w:pPr>
-        <w:ind w:left="360"/>
-      </w:pPr>
-      <w:r>
-        <w:t>NOT_SUBMITTED - Documents not uploaded</w:t>
-      </w:r>
-    </w:p>
-    <w:p>
-      <w:pPr>
-        <w:ind w:left="360"/>
-      </w:pPr>
-      <w:r>
-        <w:t>PENDING - Documents uploaded, awaiting review</w:t>
-      </w:r>
-    </w:p>
-    <w:p>
-      <w:pPr>
-        <w:ind w:left="360"/>
-      </w:pPr>
-      <w:r>
-        <w:t>VERIFIED - Documents verified</w:t>
-      </w:r>
-    </w:p>
-    <w:p>
-      <w:pPr>
-        <w:ind w:left="360"/>
-      </w:pPr>
-      <w:r>
-        <w:t>REJECTED - Documents rejected</w:t>
-      </w:r>
-    </w:p>
-    <w:p/>
-    <w:p>
-      <w:pPr>
-        <w:pStyle w:val="Heading2"/>
-        <w:rPr>
-          <w:highlight w:val="yellow"/>
-        </w:rPr>
-      </w:pPr>
-      <w:r>
-        <w:rPr>
-          <w:highlight w:val="yellow"/>
-        </w:rPr>
-        <w:t>Delete Craftsman Account</w:t>
-      </w:r>
-    </w:p>
-    <w:p>
-      <w:r>
-        <w:t>Deletes craftsman account and all associated files.</w:t>
-      </w:r>
-    </w:p>
-    <w:p>
-      <w:r>
-        <w:t>Type: DELETE</w:t>
-      </w:r>
-    </w:p>
-    <w:p>
-      <w:r>
-        <w:t>Endpoint: {</w:t>
-      </w:r>
-      <w:proofErr w:type="spellStart"/>
-      <w:r>
-        <w:t>BaseURL</w:t>
-      </w:r>
-      <w:proofErr w:type="spellEnd"/>
-      <w:r>
-        <w:t>}/craftsman/{</w:t>
-      </w:r>
-      <w:proofErr w:type="spellStart"/>
-      <w:r>
-        <w:t>craftsmanId</w:t>
-      </w:r>
-      <w:proofErr w:type="spellEnd"/>
-      <w:r>
-        <w:t>}</w:t>
-      </w:r>
-    </w:p>
-    <w:p>
-      <w:pPr>
-        <w:pStyle w:val="Heading3"/>
-      </w:pPr>
-      <w:r>
-        <w:t>Headers</w:t>
-      </w:r>
-    </w:p>
-    <w:p>
-      <w:pPr>
-        <w:ind w:firstLine="360"/>
-      </w:pPr>
-      <w:proofErr w:type="spellStart"/>
-      <w:r>
-        <w:t>userId</w:t>
-      </w:r>
-      <w:proofErr w:type="spellEnd"/>
-      <w:r>
-        <w:t>: user123</w:t>
-      </w:r>
-    </w:p>
-    <w:p>
-      <w:pPr>
-        <w:pStyle w:val="Heading3"/>
-      </w:pPr>
-      <w:r>
-        <w:t>Response (200 OK)</w:t>
-      </w:r>
-    </w:p>
-    <w:p>
-      <w:pPr>
-        <w:ind w:left="360"/>
-        <w:rPr>
-          <w:rFonts w:ascii="Consolas" w:hAnsi="Consolas"/>
-        </w:rPr>
-      </w:pPr>
-      <w:proofErr w:type="spellStart"/>
-      <w:r>
-        <w:rPr>
-          <w:rFonts w:ascii="Consolas" w:hAnsi="Consolas"/>
-        </w:rPr>
-        <w:t>json</w:t>
-      </w:r>
-      <w:proofErr w:type="spellEnd"/>
-    </w:p>
-    <w:p>
-      <w:pPr>
-        <w:ind w:left="360"/>
-        <w:rPr>
-          <w:rFonts w:ascii="Consolas" w:hAnsi="Consolas"/>
-        </w:rPr>
-      </w:pPr>
-      <w:r>
-        <w:rPr>
-          <w:rFonts w:ascii="Consolas" w:hAnsi="Consolas"/>
-        </w:rPr>
-        <w:t>{</w:t>
-      </w:r>
-    </w:p>
-    <w:p>
-      <w:pPr>
-        <w:ind w:left="360"/>
-        <w:rPr>
-          <w:rFonts w:ascii="Consolas" w:hAnsi="Consolas"/>
-        </w:rPr>
-      </w:pPr>
-      <w:r>
-        <w:rPr>
-          <w:rFonts w:ascii="Consolas" w:hAnsi="Consolas"/>
-        </w:rPr>
-        <w:t xml:space="preserve">    "success": true,</w:t>
-      </w:r>
-    </w:p>
-    <w:p>
-      <w:pPr>
-        <w:ind w:left="360"/>
-        <w:rPr>
-          <w:rFonts w:ascii="Consolas" w:hAnsi="Consolas"/>
-        </w:rPr>
-      </w:pPr>
-      <w:r>
-        <w:rPr>
-          <w:rFonts w:ascii="Consolas" w:hAnsi="Consolas"/>
-        </w:rPr>
-        <w:t xml:space="preserve">    "message": "Craftsman account deleted successfully"</w:t>
-      </w:r>
-    </w:p>
-    <w:p>
-      <w:pPr>
-        <w:ind w:left="360"/>
-      </w:pPr>
-      <w:r>
-        <w:rPr>
-          <w:rFonts w:ascii="Consolas" w:hAnsi="Consolas"/>
-        </w:rPr>
-        <w:lastRenderedPageBreak/>
-        <w:t>}</w:t>
-      </w:r>
-    </w:p>
-    <w:p>
-      <w:pPr>
-        <w:pStyle w:val="Heading3"/>
-      </w:pPr>
-      <w:r>
-        <w:t>Common Error Response Format</w:t>
-      </w:r>
-    </w:p>
-    <w:p>
-      <w:pPr>
-        <w:ind w:left="360"/>
-      </w:pPr>
-      <w:proofErr w:type="spellStart"/>
-      <w:r>
-        <w:t>json</w:t>
-      </w:r>
-      <w:proofErr w:type="spellEnd"/>
-    </w:p>
-    <w:p>
-      <w:pPr>
-        <w:ind w:left="360"/>
-      </w:pPr>
-      <w:r>
-        <w:t>{</w:t>
-      </w:r>
-    </w:p>
-    <w:p>
-      <w:pPr>
-        <w:ind w:left="360"/>
-      </w:pPr>
-      <w:r>
-        <w:t xml:space="preserve">    "code": "ERROR_CODE",</w:t>
-      </w:r>
-    </w:p>
-    <w:p>
-      <w:pPr>
-        <w:ind w:left="360"/>
-      </w:pPr>
-      <w:r>
-        <w:t xml:space="preserve">    "message": "Human readable error message",</w:t>
-      </w:r>
-    </w:p>
-    <w:p>
-      <w:pPr>
-        <w:ind w:left="360"/>
-      </w:pPr>
-      <w:r>
         <w:t xml:space="preserve">    "timestamp": "2024-11-21T10:30:00Z"</w:t>
       </w:r>
     </w:p>
@@ -3795,7 +4226,7 @@
   <w:abstractNum w:abstractNumId="9" w15:restartNumberingAfterBreak="0">
     <w:nsid w:val="546873C7"/>
     <w:multiLevelType w:val="multilevel"/>
-    <w:tmpl w:val="CE504894"/>
+    <w:tmpl w:val="4E2422E0"/>
     <w:lvl w:ilvl="0">
       <w:start w:val="1"/>
       <w:numFmt w:val="decimal"/>
@@ -5016,6 +5447,36 @@
   </w:num>
   <w:num w:numId="19" w16cid:durableId="663239187">
     <w:abstractNumId w:val="3"/>
+  </w:num>
+  <w:num w:numId="20" w16cid:durableId="503790031">
+    <w:abstractNumId w:val="9"/>
+    <w:lvlOverride w:ilvl="0">
+      <w:startOverride w:val="1"/>
+    </w:lvlOverride>
+    <w:lvlOverride w:ilvl="1">
+      <w:startOverride w:val="1"/>
+    </w:lvlOverride>
+    <w:lvlOverride w:ilvl="2">
+      <w:startOverride w:val="1"/>
+    </w:lvlOverride>
+    <w:lvlOverride w:ilvl="3">
+      <w:startOverride w:val="1"/>
+    </w:lvlOverride>
+    <w:lvlOverride w:ilvl="4">
+      <w:startOverride w:val="1"/>
+    </w:lvlOverride>
+    <w:lvlOverride w:ilvl="5">
+      <w:startOverride w:val="1"/>
+    </w:lvlOverride>
+    <w:lvlOverride w:ilvl="6">
+      <w:startOverride w:val="1"/>
+    </w:lvlOverride>
+    <w:lvlOverride w:ilvl="7">
+      <w:startOverride w:val="1"/>
+    </w:lvlOverride>
+    <w:lvlOverride w:ilvl="8">
+      <w:startOverride w:val="1"/>
+    </w:lvlOverride>
   </w:num>
 </w:numbering>
 </file>
@@ -5484,7 +5945,7 @@
     <w:uiPriority w:val="9"/>
     <w:unhideWhenUsed/>
     <w:qFormat/>
-    <w:rsid w:val="00901B77"/>
+    <w:rsid w:val="004B25C1"/>
     <w:pPr>
       <w:keepNext/>
       <w:keepLines/>
@@ -5640,7 +6101,6 @@
   <w:style w:type="character" w:default="1" w:styleId="DefaultParagraphFont">
     <w:name w:val="Default Paragraph Font"/>
     <w:uiPriority w:val="1"/>
-    <w:semiHidden/>
     <w:unhideWhenUsed/>
   </w:style>
   <w:style w:type="table" w:default="1" w:styleId="TableNormal">
@@ -5697,7 +6157,7 @@
     <w:basedOn w:val="DefaultParagraphFont"/>
     <w:link w:val="Heading3"/>
     <w:uiPriority w:val="9"/>
-    <w:rsid w:val="00901B77"/>
+    <w:rsid w:val="004B25C1"/>
     <w:rPr>
       <w:rFonts w:asciiTheme="majorBidi" w:eastAsiaTheme="majorEastAsia" w:hAnsiTheme="majorBidi" w:cstheme="majorBidi"/>
       <w:b/>

</xml_diff>